<commit_message>
docs(d3): publication-quality figure rebuild — PRISMA-2020 flow with text-extent-derived geometry + restyled D2 figures, event counts 59->60
</commit_message>
<xml_diff>
--- a/workspaces/ai-research-harnesses-trust/reports/manuscript_draft_v3.docx
+++ b/workspaces/ai-research-harnesses-trust/reports/manuscript_draft_v3.docx
@@ -288,7 +288,7 @@
         <w:t>audit/journal.jsonl</w:t>
       </w:r>
       <w:r>
-        <w:t>, 59 events). The corpus window (January 2023 – September 2026) is frozen for Version 1.0 at corpus finalization; §3.8 defines how the trailing publication-date boundary and subsequent evidence are absorbed in later versions.</w:t>
+        <w:t>, 60 events). The corpus window (January 2023 – September 2026) is frozen for Version 1.0 at corpus finalization; §3.8 defines how the trailing publication-date boundary and subsequent evidence are absorbed in later versions.</w:t>
       </w:r>
     </w:p>
     <w:p>
@@ -860,7 +860,7 @@
       <w:r>
         <w:drawing>
           <wp:inline xmlns:a="http://schemas.openxmlformats.org/drawingml/2006/main" xmlns:pic="http://schemas.openxmlformats.org/drawingml/2006/picture">
-            <wp:extent cx="5669280" cy="6271725"/>
+            <wp:extent cx="5669280" cy="6898762"/>
             <wp:docPr id="1" name="Picture 1"/>
             <wp:cNvGraphicFramePr>
               <a:graphicFrameLocks noChangeAspect="1"/>
@@ -881,7 +881,7 @@
                   <pic:spPr>
                     <a:xfrm>
                       <a:off x="0" y="0"/>
-                      <a:ext cx="5669280" cy="6271725"/>
+                      <a:ext cx="5669280" cy="6898762"/>
                     </a:xfrm>
                     <a:prstGeom prst="rect"/>
                   </pic:spPr>
@@ -1289,7 +1289,7 @@
       <w:r>
         <w:drawing>
           <wp:inline xmlns:a="http://schemas.openxmlformats.org/drawingml/2006/main" xmlns:pic="http://schemas.openxmlformats.org/drawingml/2006/picture">
-            <wp:extent cx="5669280" cy="2801291"/>
+            <wp:extent cx="5669280" cy="2834640"/>
             <wp:docPr id="2" name="Picture 2"/>
             <wp:cNvGraphicFramePr>
               <a:graphicFrameLocks noChangeAspect="1"/>
@@ -1310,7 +1310,7 @@
                   <pic:spPr>
                     <a:xfrm>
                       <a:off x="0" y="0"/>
-                      <a:ext cx="5669280" cy="2801291"/>
+                      <a:ext cx="5669280" cy="2834640"/>
                     </a:xfrm>
                     <a:prstGeom prst="rect"/>
                   </pic:spPr>
@@ -2583,7 +2583,7 @@
       <w:r>
         <w:drawing>
           <wp:inline xmlns:a="http://schemas.openxmlformats.org/drawingml/2006/main" xmlns:pic="http://schemas.openxmlformats.org/drawingml/2006/picture">
-            <wp:extent cx="5669280" cy="2381098"/>
+            <wp:extent cx="5669280" cy="2398542"/>
             <wp:docPr id="3" name="Picture 3"/>
             <wp:cNvGraphicFramePr>
               <a:graphicFrameLocks noChangeAspect="1"/>
@@ -2604,7 +2604,7 @@
                   <pic:spPr>
                     <a:xfrm>
                       <a:off x="0" y="0"/>
-                      <a:ext cx="5669280" cy="2381098"/>
+                      <a:ext cx="5669280" cy="2398542"/>
                     </a:xfrm>
                     <a:prstGeom prst="rect"/>
                   </pic:spPr>
@@ -2634,7 +2634,7 @@
       <w:r>
         <w:drawing>
           <wp:inline xmlns:a="http://schemas.openxmlformats.org/drawingml/2006/main" xmlns:pic="http://schemas.openxmlformats.org/drawingml/2006/picture">
-            <wp:extent cx="5669280" cy="2801291"/>
+            <wp:extent cx="5669280" cy="2834640"/>
             <wp:docPr id="4" name="Picture 4"/>
             <wp:cNvGraphicFramePr>
               <a:graphicFrameLocks noChangeAspect="1"/>
@@ -2655,7 +2655,7 @@
                   <pic:spPr>
                     <a:xfrm>
                       <a:off x="0" y="0"/>
-                      <a:ext cx="5669280" cy="2801291"/>
+                      <a:ext cx="5669280" cy="2834640"/>
                     </a:xfrm>
                     <a:prstGeom prst="rect"/>
                   </pic:spPr>
@@ -2685,7 +2685,7 @@
       <w:r>
         <w:drawing>
           <wp:inline xmlns:a="http://schemas.openxmlformats.org/drawingml/2006/main" xmlns:pic="http://schemas.openxmlformats.org/drawingml/2006/picture">
-            <wp:extent cx="5669280" cy="3174797"/>
+            <wp:extent cx="5669280" cy="3282215"/>
             <wp:docPr id="5" name="Picture 5"/>
             <wp:cNvGraphicFramePr>
               <a:graphicFrameLocks noChangeAspect="1"/>
@@ -2706,7 +2706,7 @@
                   <pic:spPr>
                     <a:xfrm>
                       <a:off x="0" y="0"/>
-                      <a:ext cx="5669280" cy="3174797"/>
+                      <a:ext cx="5669280" cy="3282215"/>
                     </a:xfrm>
                     <a:prstGeom prst="rect"/>
                   </pic:spPr>
@@ -3352,7 +3352,7 @@
         <w:t>audit/journal.jsonl</w:t>
       </w:r>
       <w:r>
-        <w:t xml:space="preserve"> (59 events). Version stamp: Review 1.0, corpus finalized 2026-09-09.</w:t>
+        <w:t xml:space="preserve"> (60 events). Version stamp: Review 1.0, corpus finalized 2026-09-09.</w:t>
       </w:r>
     </w:p>
     <w:p>

</xml_diff>

<commit_message>
fix(d3): HTML export bold-mangling bug in export_manuscript.py + artifact QA script, event counts 60->61
</commit_message>
<xml_diff>
--- a/workspaces/ai-research-harnesses-trust/reports/manuscript_draft_v3.docx
+++ b/workspaces/ai-research-harnesses-trust/reports/manuscript_draft_v3.docx
@@ -288,7 +288,7 @@
         <w:t>audit/journal.jsonl</w:t>
       </w:r>
       <w:r>
-        <w:t>, 60 events). The corpus window (January 2023 – September 2026) is frozen for Version 1.0 at corpus finalization; §3.8 defines how the trailing publication-date boundary and subsequent evidence are absorbed in later versions.</w:t>
+        <w:t>, 61 events). The corpus window (January 2023 – September 2026) is frozen for Version 1.0 at corpus finalization; §3.8 defines how the trailing publication-date boundary and subsequent evidence are absorbed in later versions.</w:t>
       </w:r>
     </w:p>
     <w:p>
@@ -3352,7 +3352,7 @@
         <w:t>audit/journal.jsonl</w:t>
       </w:r>
       <w:r>
-        <w:t xml:space="preserve"> (60 events). Version stamp: Review 1.0, corpus finalized 2026-09-09.</w:t>
+        <w:t xml:space="preserve"> (61 events). Version stamp: Review 1.0, corpus finalized 2026-09-09.</w:t>
       </w:r>
     </w:p>
     <w:p>

</xml_diff>

<commit_message>
docs(d3): LUMEN arXiv spot-check passed (2606.28362 resolves to ref [12]) + OSF submission snippet prepared, event counts 61->63
</commit_message>
<xml_diff>
--- a/workspaces/ai-research-harnesses-trust/reports/manuscript_draft_v3.docx
+++ b/workspaces/ai-research-harnesses-trust/reports/manuscript_draft_v3.docx
@@ -288,7 +288,7 @@
         <w:t>audit/journal.jsonl</w:t>
       </w:r>
       <w:r>
-        <w:t>, 61 events). The corpus window (January 2023 – September 2026) is frozen for Version 1.0 at corpus finalization; §3.8 defines how the trailing publication-date boundary and subsequent evidence are absorbed in later versions.</w:t>
+        <w:t>, 63 events). The corpus window (January 2023 – September 2026) is frozen for Version 1.0 at corpus finalization; §3.8 defines how the trailing publication-date boundary and subsequent evidence are absorbed in later versions.</w:t>
       </w:r>
     </w:p>
     <w:p>
@@ -3352,7 +3352,7 @@
         <w:t>audit/journal.jsonl</w:t>
       </w:r>
       <w:r>
-        <w:t xml:space="preserve"> (61 events). Version stamp: Review 1.0, corpus finalized 2026-09-09.</w:t>
+        <w:t xml:space="preserve"> (63 events). Version stamp: Review 1.0, corpus finalized 2026-09-09.</w:t>
       </w:r>
     </w:p>
     <w:p>

</xml_diff>

<commit_message>
docs(d3): final v3 submission review + OSF readiness — status finalized, '#' heading typo fixed, OSF registration date set, event counts 63->65
</commit_message>
<xml_diff>
--- a/workspaces/ai-research-harnesses-trust/reports/manuscript_draft_v3.docx
+++ b/workspaces/ai-research-harnesses-trust/reports/manuscript_draft_v3.docx
@@ -37,7 +37,7 @@
         <w:t>Manuscript status</w:t>
       </w:r>
       <w:r>
-        <w:t>: Draft v3 for author review (post-adversarial audit)</w:t>
+        <w:t>: Final version 1.0 for submission (post-adversarial audit; all review items resolved)</w:t>
       </w:r>
     </w:p>
     <w:p>
@@ -288,7 +288,7 @@
         <w:t>audit/journal.jsonl</w:t>
       </w:r>
       <w:r>
-        <w:t>, 63 events). The corpus window (January 2023 – September 2026) is frozen for Version 1.0 at corpus finalization; §3.8 defines how the trailing publication-date boundary and subsequent evidence are absorbed in later versions.</w:t>
+        <w:t>, 65 events). The corpus window (January 2023 – September 2026) is frozen for Version 1.0 at corpus finalization; §3.8 defines how the trailing publication-date boundary and subsequent evidence are absorbed in later versions.</w:t>
       </w:r>
     </w:p>
     <w:p>
@@ -3257,7 +3257,7 @@
         <w:rPr>
           <w:b/>
         </w:rPr>
-        <w:t>#Preprints and updates</w:t>
+        <w:t>Preprints and updates</w:t>
       </w:r>
       <w:r>
         <w:t xml:space="preserve">: this review explicitly includes preprint-track records (32/58). Preprint→published supersession is tracked where Crossref </w:t>
@@ -3352,7 +3352,7 @@
         <w:t>audit/journal.jsonl</w:t>
       </w:r>
       <w:r>
-        <w:t xml:space="preserve"> (63 events). Version stamp: Review 1.0, corpus finalized 2026-09-09.</w:t>
+        <w:t xml:space="preserve"> (65 events). Version stamp: Review 1.0, corpus finalized 2026-09-09.</w:t>
       </w:r>
     </w:p>
     <w:p>

</xml_diff>

<commit_message>
docs(d1,d3): state reconciliation — D1 write-up marked DONE (bundle manifest verified), D3 counts 65->66 (PLAN_RECONCILED), plan sequencing rewritten to finished-writeups stage
</commit_message>
<xml_diff>
--- a/workspaces/ai-research-harnesses-trust/reports/manuscript_draft_v3.docx
+++ b/workspaces/ai-research-harnesses-trust/reports/manuscript_draft_v3.docx
@@ -288,7 +288,7 @@
         <w:t>audit/journal.jsonl</w:t>
       </w:r>
       <w:r>
-        <w:t>, 65 events). The corpus window (January 2023 – September 2026) is frozen for Version 1.0 at corpus finalization; §3.8 defines how the trailing publication-date boundary and subsequent evidence are absorbed in later versions.</w:t>
+        <w:t>, 66 events). The corpus window (January 2023 – September 2026) is frozen for Version 1.0 at corpus finalization; §3.8 defines how the trailing publication-date boundary and subsequent evidence are absorbed in later versions.</w:t>
       </w:r>
     </w:p>
     <w:p>
@@ -3352,7 +3352,7 @@
         <w:t>audit/journal.jsonl</w:t>
       </w:r>
       <w:r>
-        <w:t xml:space="preserve"> (65 events). Version stamp: Review 1.0, corpus finalized 2026-09-09.</w:t>
+        <w:t xml:space="preserve"> (66 events). Version stamp: Review 1.0, corpus finalized 2026-09-09.</w:t>
       </w:r>
     </w:p>
     <w:p>

</xml_diff>

<commit_message>
docs(d2): final submission review — five-source wording, fair kappa, threshold wording (>=0.90 not byte-exact), figures 1-4 embedded, event counts 66->67
</commit_message>
<xml_diff>
--- a/workspaces/ai-research-harnesses-trust/reports/manuscript_draft_v3.docx
+++ b/workspaces/ai-research-harnesses-trust/reports/manuscript_draft_v3.docx
@@ -288,7 +288,7 @@
         <w:t>audit/journal.jsonl</w:t>
       </w:r>
       <w:r>
-        <w:t>, 66 events). The corpus window (January 2023 – September 2026) is frozen for Version 1.0 at corpus finalization; §3.8 defines how the trailing publication-date boundary and subsequent evidence are absorbed in later versions.</w:t>
+        <w:t>, 67 events). The corpus window (January 2023 – September 2026) is frozen for Version 1.0 at corpus finalization; §3.8 defines how the trailing publication-date boundary and subsequent evidence are absorbed in later versions.</w:t>
       </w:r>
     </w:p>
     <w:p>
@@ -3352,7 +3352,7 @@
         <w:t>audit/journal.jsonl</w:t>
       </w:r>
       <w:r>
-        <w:t xml:space="preserve"> (66 events). Version stamp: Review 1.0, corpus finalized 2026-09-09.</w:t>
+        <w:t xml:space="preserve"> (67 events). Version stamp: Review 1.0, corpus finalized 2026-09-09.</w:t>
       </w:r>
     </w:p>
     <w:p>

</xml_diff>

<commit_message>
docs(thesis): ch.1-5 assembly skeleton with chapter->source maps, ch.3 integration constraints, ch.5 synthesis inputs; event counts 67->68
</commit_message>
<xml_diff>
--- a/workspaces/ai-research-harnesses-trust/reports/manuscript_draft_v3.docx
+++ b/workspaces/ai-research-harnesses-trust/reports/manuscript_draft_v3.docx
@@ -288,7 +288,7 @@
         <w:t>audit/journal.jsonl</w:t>
       </w:r>
       <w:r>
-        <w:t>, 67 events). The corpus window (January 2023 – September 2026) is frozen for Version 1.0 at corpus finalization; §3.8 defines how the trailing publication-date boundary and subsequent evidence are absorbed in later versions.</w:t>
+        <w:t>, 68 events). The corpus window (January 2023 – September 2026) is frozen for Version 1.0 at corpus finalization; §3.8 defines how the trailing publication-date boundary and subsequent evidence are absorbed in later versions.</w:t>
       </w:r>
     </w:p>
     <w:p>
@@ -3352,7 +3352,7 @@
         <w:t>audit/journal.jsonl</w:t>
       </w:r>
       <w:r>
-        <w:t xml:space="preserve"> (67 events). Version stamp: Review 1.0, corpus finalized 2026-09-09.</w:t>
+        <w:t xml:space="preserve"> (68 events). Version stamp: Review 1.0, corpus finalized 2026-09-09.</w:t>
       </w:r>
     </w:p>
     <w:p>

</xml_diff>

<commit_message>
docs(d4): software-paper scope with claim<->P7 mapping, anchored to committed artifacts; event counts 68->69
</commit_message>
<xml_diff>
--- a/workspaces/ai-research-harnesses-trust/reports/manuscript_draft_v3.docx
+++ b/workspaces/ai-research-harnesses-trust/reports/manuscript_draft_v3.docx
@@ -288,7 +288,7 @@
         <w:t>audit/journal.jsonl</w:t>
       </w:r>
       <w:r>
-        <w:t>, 68 events). The corpus window (January 2023 – September 2026) is frozen for Version 1.0 at corpus finalization; §3.8 defines how the trailing publication-date boundary and subsequent evidence are absorbed in later versions.</w:t>
+        <w:t>, 69 events). The corpus window (January 2023 – September 2026) is frozen for Version 1.0 at corpus finalization; §3.8 defines how the trailing publication-date boundary and subsequent evidence are absorbed in later versions.</w:t>
       </w:r>
     </w:p>
     <w:p>
@@ -3352,7 +3352,7 @@
         <w:t>audit/journal.jsonl</w:t>
       </w:r>
       <w:r>
-        <w:t xml:space="preserve"> (68 events). Version stamp: Review 1.0, corpus finalized 2026-09-09.</w:t>
+        <w:t xml:space="preserve"> (69 events). Version stamp: Review 1.0, corpus finalized 2026-09-09.</w:t>
       </w:r>
     </w:p>
     <w:p>

</xml_diff>

<commit_message>
feat(latex): XeLaTeX scaffolds for D1-D4 + thesis via pandoc; count owners 69->70
</commit_message>
<xml_diff>
--- a/workspaces/ai-research-harnesses-trust/reports/manuscript_draft_v3.docx
+++ b/workspaces/ai-research-harnesses-trust/reports/manuscript_draft_v3.docx
@@ -288,7 +288,7 @@
         <w:t>audit/journal.jsonl</w:t>
       </w:r>
       <w:r>
-        <w:t>, 69 events). The corpus window (January 2023 – September 2026) is frozen for Version 1.0 at corpus finalization; §3.8 defines how the trailing publication-date boundary and subsequent evidence are absorbed in later versions.</w:t>
+        <w:t>, 70 events). The corpus window (January 2023 – September 2026) is frozen for Version 1.0 at corpus finalization; §3.8 defines how the trailing publication-date boundary and subsequent evidence are absorbed in later versions.</w:t>
       </w:r>
     </w:p>
     <w:p>
@@ -3352,7 +3352,7 @@
         <w:t>audit/journal.jsonl</w:t>
       </w:r>
       <w:r>
-        <w:t xml:space="preserve"> (69 events). Version stamp: Review 1.0, corpus finalized 2026-09-09.</w:t>
+        <w:t xml:space="preserve"> (70 events). Version stamp: Review 1.0, corpus finalized 2026-09-09.</w:t>
       </w:r>
     </w:p>
     <w:p>

</xml_diff>